<commit_message>
feat(document): add request and response body examples to generated docs
</commit_message>
<xml_diff>
--- a/assets/接口文档模板.docx
+++ b/assets/接口文档模板.docx
@@ -1267,24 +1267,41 @@
           <w:b/>
           <w:bCs/>
         </w:rPr>
-        <w:t xml:space="preserve">响应结果</w:t>
-      </w:r>
-    </w:p>
-    <w:p>
-      <w:r>
-        <w:t xml:space="preserve">{#responses}</w:t>
-      </w:r>
-    </w:p>
-    <w:p>
-      <w:pPr>
-        <w:spacing w:before="60" w:after="60"/>
+        <w:t xml:space="preserve">请求 Body 示例</w:t>
+      </w:r>
+    </w:p>
+    <w:p>
+      <w:r>
+        <w:t xml:space="preserve">{requestBodyExample}</w:t>
+      </w:r>
+    </w:p>
+    <w:p>
+      <w:pPr>
+        <w:spacing w:before="120" w:after="60"/>
       </w:pPr>
       <w:r>
         <w:rPr>
           <w:b/>
           <w:bCs/>
         </w:rPr>
-        <w:t xml:space="preserve">状态码 {statusCode}</w:t>
+        <w:t xml:space="preserve">响应结果</w:t>
+      </w:r>
+    </w:p>
+    <w:p>
+      <w:r>
+        <w:t xml:space="preserve">{#responses}</w:t>
+      </w:r>
+    </w:p>
+    <w:p>
+      <w:pPr>
+        <w:spacing w:before="60" w:after="60"/>
+      </w:pPr>
+      <w:r>
+        <w:rPr>
+          <w:b/>
+          <w:bCs/>
+        </w:rPr>
+        <w:t xml:space="preserve">状态码 {statusCode} - {description}</w:t>
       </w:r>
     </w:p>
     <w:p>
@@ -1495,6 +1512,23 @@
     <w:p>
       <w:r>
         <w:t xml:space="preserve">{/fields}</w:t>
+      </w:r>
+    </w:p>
+    <w:p>
+      <w:pPr>
+        <w:spacing w:before="60" w:after="60"/>
+      </w:pPr>
+      <w:r>
+        <w:rPr>
+          <w:b/>
+          <w:bCs/>
+        </w:rPr>
+        <w:t xml:space="preserve">响应 Body 示例</w:t>
+      </w:r>
+    </w:p>
+    <w:p>
+      <w:r>
+        <w:t xml:space="preserve">{bodyExample}</w:t>
       </w:r>
     </w:p>
     <w:p>

</xml_diff>

<commit_message>
refactor(settings): add option to toggle repeated table headers on page break
- Introduce "repeatTableHeaderOnPageBreak" setting in generation settings
- Add UI switch in SettingsPanel to enable/disable repeated table headers
- Persist the setting changes using saveGenerationSettings
- Read the setting on docx generation to conditionally remove repeated headers
- Implement removeRepeatTableHeaders method to strip Word table header tags
- Clean up leftover Handlebars block tags in API template for parameters
- Remove redundant paragraph wrappers around Handlebars blocks in docx template
- Remove unused CSS class "flex-1" from generate buttons in panel components
</commit_message>
<xml_diff>
--- a/assets/接口文档模板.docx
+++ b/assets/接口文档模板.docx
@@ -464,11 +464,6 @@
           <w:bCs/>
         </w:rPr>
         <w:t xml:space="preserve">Path 参数</w:t>
-      </w:r>
-    </w:p>
-    <w:p>
-      <w:r>
-        <w:t xml:space="preserve">{#pathParams}</w:t>
       </w:r>
     </w:p>
     <w:tbl>
@@ -644,7 +639,7 @@
           </w:tcPr>
           <w:p>
             <w:r>
-              <w:t xml:space="preserve">{name}</w:t>
+              <w:t xml:space="preserve">{#pathParams}{name}</w:t>
             </w:r>
           </w:p>
         </w:tc>
@@ -711,17 +706,12 @@
           </w:tcPr>
           <w:p>
             <w:r>
-              <w:t xml:space="preserve">{description}</w:t>
+              <w:t xml:space="preserve">{description}{/pathParams}</w:t>
             </w:r>
           </w:p>
         </w:tc>
       </w:tr>
     </w:tbl>
-    <w:p>
-      <w:r>
-        <w:t xml:space="preserve">{/pathParams}</w:t>
-      </w:r>
-    </w:p>
     <w:p>
       <w:pPr>
         <w:spacing w:before="120" w:after="60"/>
@@ -732,11 +722,6 @@
           <w:bCs/>
         </w:rPr>
         <w:t xml:space="preserve">Query 参数</w:t>
-      </w:r>
-    </w:p>
-    <w:p>
-      <w:r>
-        <w:t xml:space="preserve">{#queryParams}</w:t>
       </w:r>
     </w:p>
     <w:tbl>
@@ -912,7 +897,7 @@
           </w:tcPr>
           <w:p>
             <w:r>
-              <w:t xml:space="preserve">{name}</w:t>
+              <w:t xml:space="preserve">{#queryParams}{name}</w:t>
             </w:r>
           </w:p>
         </w:tc>
@@ -979,17 +964,12 @@
           </w:tcPr>
           <w:p>
             <w:r>
-              <w:t xml:space="preserve">{description}</w:t>
+              <w:t xml:space="preserve">{description}{/queryParams}</w:t>
             </w:r>
           </w:p>
         </w:tc>
       </w:tr>
     </w:tbl>
-    <w:p>
-      <w:r>
-        <w:t xml:space="preserve">{/queryParams}</w:t>
-      </w:r>
-    </w:p>
     <w:p>
       <w:pPr>
         <w:spacing w:before="120" w:after="60"/>
@@ -1000,11 +980,6 @@
           <w:bCs/>
         </w:rPr>
         <w:t xml:space="preserve">Body 参数（JSON）</w:t>
-      </w:r>
-    </w:p>
-    <w:p>
-      <w:r>
-        <w:t xml:space="preserve">{#bodyParams}</w:t>
       </w:r>
     </w:p>
     <w:tbl>
@@ -1180,7 +1155,7 @@
           </w:tcPr>
           <w:p>
             <w:r>
-              <w:t xml:space="preserve">{name}</w:t>
+              <w:t xml:space="preserve">{#bodyParams}{name}</w:t>
             </w:r>
           </w:p>
         </w:tc>
@@ -1247,17 +1222,12 @@
           </w:tcPr>
           <w:p>
             <w:r>
-              <w:t xml:space="preserve">{description}</w:t>
+              <w:t xml:space="preserve">{description}{/bodyParams}</w:t>
             </w:r>
           </w:p>
         </w:tc>
       </w:tr>
     </w:tbl>
-    <w:p>
-      <w:r>
-        <w:t xml:space="preserve">{/bodyParams}</w:t>
-      </w:r>
-    </w:p>
     <w:p>
       <w:pPr>
         <w:spacing w:before="120" w:after="60"/>
@@ -1302,11 +1272,6 @@
           <w:bCs/>
         </w:rPr>
         <w:t xml:space="preserve">状态码 {statusCode} - {description}</w:t>
-      </w:r>
-    </w:p>
-    <w:p>
-      <w:r>
-        <w:t xml:space="preserve">{#fields}</w:t>
       </w:r>
     </w:p>
     <w:tbl>
@@ -1455,7 +1420,7 @@
           </w:tcPr>
           <w:p>
             <w:r>
-              <w:t xml:space="preserve">{name}</w:t>
+              <w:t xml:space="preserve">{#fields}{name}</w:t>
             </w:r>
           </w:p>
         </w:tc>
@@ -1503,17 +1468,12 @@
           </w:tcPr>
           <w:p>
             <w:r>
-              <w:t xml:space="preserve">{description}</w:t>
+              <w:t xml:space="preserve">{description}{/fields}</w:t>
             </w:r>
           </w:p>
         </w:tc>
       </w:tr>
     </w:tbl>
-    <w:p>
-      <w:r>
-        <w:t xml:space="preserve">{/fields}</w:t>
-      </w:r>
-    </w:p>
     <w:p>
       <w:pPr>
         <w:spacing w:before="60" w:after="60"/>

</xml_diff>

<commit_message>
feat(docx): conditionally hide empty parameter sections in API template
Wrap Path/Query/Body parameter titles and tables with conditional tags
so they are completely hidden when an API has no parameters of that type.
Add hasPathParams/hasQueryParams/hasBodyParams boolean flags to template data.

Co-Authored-By: Claude Opus 4.6 <noreply@anthropic.com>
</commit_message>
<xml_diff>
--- a/assets/接口文档模板.docx
+++ b/assets/接口文档模板.docx
@@ -454,6 +454,11 @@
         </w:tc>
       </w:tr>
     </w:tbl>
+    <w:p>
+      <w:r>
+        <w:t xml:space="preserve">{#hasPathParams}</w:t>
+      </w:r>
+    </w:p>
     <w:p>
       <w:pPr>
         <w:spacing w:before="120" w:after="60"/>
@@ -713,6 +718,16 @@
       </w:tr>
     </w:tbl>
     <w:p>
+      <w:r>
+        <w:t xml:space="preserve">{/hasPathParams}</w:t>
+      </w:r>
+    </w:p>
+    <w:p>
+      <w:r>
+        <w:t xml:space="preserve">{#hasQueryParams}</w:t>
+      </w:r>
+    </w:p>
+    <w:p>
       <w:pPr>
         <w:spacing w:before="120" w:after="60"/>
       </w:pPr>
@@ -971,6 +986,16 @@
       </w:tr>
     </w:tbl>
     <w:p>
+      <w:r>
+        <w:t xml:space="preserve">{/hasQueryParams}</w:t>
+      </w:r>
+    </w:p>
+    <w:p>
+      <w:r>
+        <w:t xml:space="preserve">{#hasBodyParams}</w:t>
+      </w:r>
+    </w:p>
+    <w:p>
       <w:pPr>
         <w:spacing w:before="120" w:after="60"/>
       </w:pPr>
@@ -1243,6 +1268,11 @@
     <w:p>
       <w:r>
         <w:t xml:space="preserve">{requestBodyExample}</w:t>
+      </w:r>
+    </w:p>
+    <w:p>
+      <w:r>
+        <w:t xml:space="preserve">{/hasBodyParams}</w:t>
       </w:r>
     </w:p>
     <w:p>

</xml_diff>